<commit_message>
Add footnotes to sample.docx for testing note preview
Co-Authored-By: Claude Opus 4.6 <noreply@anthropic.com>
</commit_message>
<xml_diff>
--- a/docs/sample.docx
+++ b/docs/sample.docx
@@ -30,6 +30,12 @@
       </w:r>
       <w:r>
         <w:t xml:space="preserve"> is an international standard for representing texts in digital form. It is widely used in libraries, museums, publishers, and academic research.</w:t>
+      </w:r>
+      <w:r>
+        <w:rPr>
+          <w:rStyle w:val="FootnoteReference"/>
+        </w:rPr>
+        <w:footnoteReference w:id="1"/>
       </w:r>
     </w:p>
     <w:p>
@@ -115,6 +121,12 @@
       </w:r>
       <w:r>
         <w:t xml:space="preserve"> in every TEI document.</w:t>
+      </w:r>
+      <w:r>
+        <w:rPr>
+          <w:rStyle w:val="FootnoteReference"/>
+        </w:rPr>
+        <w:footnoteReference w:id="2"/>
       </w:r>
     </w:p>
     <w:p>
@@ -556,6 +568,57 @@
 </w:document>
 </file>
 
+<file path=word/footnotes.xml><?xml version="1.0" encoding="utf-8"?>
+<w:footnotes xmlns:w="http://schemas.openxmlformats.org/wordprocessingml/2006/main">
+  <w:footnote w:type="separator" w:id="-1">
+    <w:p>
+      <w:r>
+        <w:separator/>
+      </w:r>
+    </w:p>
+  </w:footnote>
+  <w:footnote w:type="continuationSeparator" w:id="0">
+    <w:p>
+      <w:r>
+        <w:continuationSeparator/>
+      </w:r>
+    </w:p>
+  </w:footnote>
+  <w:footnote w:id="1">
+    <w:p>
+      <w:pPr>
+        <w:pStyle w:val="FootnoteText"/>
+      </w:pPr>
+      <w:r>
+        <w:rPr>
+          <w:rStyle w:val="FootnoteReference"/>
+        </w:rPr>
+        <w:footnoteRef/>
+      </w:r>
+      <w:r>
+        <w:t xml:space="preserve"> TEI was originally established in 1987 and has since become the de facto standard for text encoding in the digital humanities. / TEIは1987年に設立され、デジタル人文学におけるテキストエンコーディングの事実上の標準となりました。</w:t>
+      </w:r>
+    </w:p>
+  </w:footnote>
+  <w:footnote w:id="2">
+    <w:p>
+      <w:pPr>
+        <w:pStyle w:val="FootnoteText"/>
+      </w:pPr>
+      <w:r>
+        <w:rPr>
+          <w:rStyle w:val="FootnoteReference"/>
+        </w:rPr>
+        <w:footnoteRef/>
+      </w:r>
+      <w:r>
+        <w:t xml:space="preserve"> See the official TEI Guidelines at https://tei-c.org/guidelines/ for the complete specification. / 完全な仕様については、TEI公式ガイドライン https://tei-c.org/guidelines/ を参照してください。</w:t>
+      </w:r>
+    </w:p>
+  </w:footnote>
+</w:footnotes>
+</file>
+
 <file path=word/numbering.xml><?xml version="1.0" encoding="utf-8"?>
 <w:numbering xmlns:wpc="http://schemas.microsoft.com/office/word/2010/wordprocessingCanvas" xmlns:mo="http://schemas.microsoft.com/office/mac/office/2008/main" xmlns:mc="http://schemas.openxmlformats.org/markup-compatibility/2006" xmlns:mv="urn:schemas-microsoft-com:mac:vml" xmlns:o="urn:schemas-microsoft-com:office:office" xmlns:r="http://schemas.openxmlformats.org/officeDocument/2006/relationships" xmlns:m="http://schemas.openxmlformats.org/officeDocument/2006/math" xmlns:v="urn:schemas-microsoft-com:vml" xmlns:wp14="http://schemas.microsoft.com/office/word/2010/wordprocessingDrawing" xmlns:wp="http://schemas.openxmlformats.org/drawingml/2006/wordprocessingDrawing" xmlns:w10="urn:schemas-microsoft-com:office:word" xmlns:w="http://schemas.openxmlformats.org/wordprocessingml/2006/main" xmlns:w14="http://schemas.microsoft.com/office/word/2010/wordml" xmlns:wpg="http://schemas.microsoft.com/office/word/2010/wordprocessingGroup" xmlns:wpi="http://schemas.microsoft.com/office/word/2010/wordprocessingInk" xmlns:wne="http://schemas.microsoft.com/office/word/2006/wordml" xmlns:wps="http://schemas.microsoft.com/office/word/2010/wordprocessingShape" mc:Ignorable="w14 wp14">
   <w:abstractNum w:abstractNumId="0">

</xml_diff>